<commit_message>
fix math spacing and textbox duplication natively
Signed-off-by: riyo264 <supriyodhani50@gmail.com>
</commit_message>
<xml_diff>
--- a/tests/data/docx/drawingml.docx
+++ b/tests/data/docx/drawingml.docx
@@ -367,83 +367,83 @@
                         <a:custGeom>
                           <a:avLst/>
                           <a:gdLst>
-                            <a:gd name="connsiteX0" fmla="*/ 579053 w 1757152"/>
-                            <a:gd name="connsiteY0" fmla="*/ 531722 h 1387851"/>
-                            <a:gd name="connsiteX1" fmla="*/ 538711 w 1757152"/>
-                            <a:gd name="connsiteY1" fmla="*/ 1257863 h 1387851"/>
-                            <a:gd name="connsiteX2" fmla="*/ 1193135 w 1757152"/>
-                            <a:gd name="connsiteY2" fmla="*/ 742392 h 1387851"/>
-                            <a:gd name="connsiteX3" fmla="*/ 1013841 w 1757152"/>
-                            <a:gd name="connsiteY3" fmla="*/ 1387851 h 1387851"/>
-                            <a:gd name="connsiteX4" fmla="*/ 807653 w 1757152"/>
-                            <a:gd name="connsiteY4" fmla="*/ 746875 h 1387851"/>
-                            <a:gd name="connsiteX5" fmla="*/ 1632405 w 1757152"/>
-                            <a:gd name="connsiteY5" fmla="*/ 1307169 h 1387851"/>
-                            <a:gd name="connsiteX6" fmla="*/ 1731017 w 1757152"/>
-                            <a:gd name="connsiteY6" fmla="*/ 195545 h 1387851"/>
-                            <a:gd name="connsiteX7" fmla="*/ 1403805 w 1757152"/>
-                            <a:gd name="connsiteY7" fmla="*/ 706533 h 1387851"/>
-                            <a:gd name="connsiteX8" fmla="*/ 1341053 w 1757152"/>
-                            <a:gd name="connsiteY8" fmla="*/ 235886 h 1387851"/>
-                            <a:gd name="connsiteX9" fmla="*/ 1094523 w 1757152"/>
-                            <a:gd name="connsiteY9" fmla="*/ 347945 h 1387851"/>
-                            <a:gd name="connsiteX10" fmla="*/ 861441 w 1757152"/>
-                            <a:gd name="connsiteY10" fmla="*/ 2804 h 1387851"/>
-                            <a:gd name="connsiteX11" fmla="*/ 718005 w 1757152"/>
-                            <a:gd name="connsiteY11" fmla="*/ 182098 h 1387851"/>
-                            <a:gd name="connsiteX12" fmla="*/ 829 w 1757152"/>
-                            <a:gd name="connsiteY12" fmla="*/ 132792 h 1387851"/>
-                            <a:gd name="connsiteX13" fmla="*/ 874888 w 1757152"/>
-                            <a:gd name="connsiteY13" fmla="*/ 137275 h 1387851"/>
-                            <a:gd name="connsiteX14" fmla="*/ 579053 w 1757152"/>
-                            <a:gd name="connsiteY14" fmla="*/ 531722 h 1387851"/>
+                            <a:gd name="csX0" fmla="*/ 579053 w 1757152"/>
+                            <a:gd name="csY0" fmla="*/ 531722 h 1387851"/>
+                            <a:gd name="csX1" fmla="*/ 538711 w 1757152"/>
+                            <a:gd name="csY1" fmla="*/ 1257863 h 1387851"/>
+                            <a:gd name="csX2" fmla="*/ 1193135 w 1757152"/>
+                            <a:gd name="csY2" fmla="*/ 742392 h 1387851"/>
+                            <a:gd name="csX3" fmla="*/ 1013841 w 1757152"/>
+                            <a:gd name="csY3" fmla="*/ 1387851 h 1387851"/>
+                            <a:gd name="csX4" fmla="*/ 807653 w 1757152"/>
+                            <a:gd name="csY4" fmla="*/ 746875 h 1387851"/>
+                            <a:gd name="csX5" fmla="*/ 1632405 w 1757152"/>
+                            <a:gd name="csY5" fmla="*/ 1307169 h 1387851"/>
+                            <a:gd name="csX6" fmla="*/ 1731017 w 1757152"/>
+                            <a:gd name="csY6" fmla="*/ 195545 h 1387851"/>
+                            <a:gd name="csX7" fmla="*/ 1403805 w 1757152"/>
+                            <a:gd name="csY7" fmla="*/ 706533 h 1387851"/>
+                            <a:gd name="csX8" fmla="*/ 1341053 w 1757152"/>
+                            <a:gd name="csY8" fmla="*/ 235886 h 1387851"/>
+                            <a:gd name="csX9" fmla="*/ 1094523 w 1757152"/>
+                            <a:gd name="csY9" fmla="*/ 347945 h 1387851"/>
+                            <a:gd name="csX10" fmla="*/ 861441 w 1757152"/>
+                            <a:gd name="csY10" fmla="*/ 2804 h 1387851"/>
+                            <a:gd name="csX11" fmla="*/ 718005 w 1757152"/>
+                            <a:gd name="csY11" fmla="*/ 182098 h 1387851"/>
+                            <a:gd name="csX12" fmla="*/ 829 w 1757152"/>
+                            <a:gd name="csY12" fmla="*/ 132792 h 1387851"/>
+                            <a:gd name="csX13" fmla="*/ 874888 w 1757152"/>
+                            <a:gd name="csY13" fmla="*/ 137275 h 1387851"/>
+                            <a:gd name="csX14" fmla="*/ 579053 w 1757152"/>
+                            <a:gd name="csY14" fmla="*/ 531722 h 1387851"/>
                           </a:gdLst>
                           <a:ahLst/>
                           <a:cxnLst>
                             <a:cxn ang="0">
-                              <a:pos x="connsiteX0" y="connsiteY0"/>
+                              <a:pos x="csX0" y="csY0"/>
                             </a:cxn>
                             <a:cxn ang="0">
-                              <a:pos x="connsiteX1" y="connsiteY1"/>
+                              <a:pos x="csX1" y="csY1"/>
                             </a:cxn>
                             <a:cxn ang="0">
-                              <a:pos x="connsiteX2" y="connsiteY2"/>
+                              <a:pos x="csX2" y="csY2"/>
                             </a:cxn>
                             <a:cxn ang="0">
-                              <a:pos x="connsiteX3" y="connsiteY3"/>
+                              <a:pos x="csX3" y="csY3"/>
                             </a:cxn>
                             <a:cxn ang="0">
-                              <a:pos x="connsiteX4" y="connsiteY4"/>
+                              <a:pos x="csX4" y="csY4"/>
                             </a:cxn>
                             <a:cxn ang="0">
-                              <a:pos x="connsiteX5" y="connsiteY5"/>
+                              <a:pos x="csX5" y="csY5"/>
                             </a:cxn>
                             <a:cxn ang="0">
-                              <a:pos x="connsiteX6" y="connsiteY6"/>
+                              <a:pos x="csX6" y="csY6"/>
                             </a:cxn>
                             <a:cxn ang="0">
-                              <a:pos x="connsiteX7" y="connsiteY7"/>
+                              <a:pos x="csX7" y="csY7"/>
                             </a:cxn>
                             <a:cxn ang="0">
-                              <a:pos x="connsiteX8" y="connsiteY8"/>
+                              <a:pos x="csX8" y="csY8"/>
                             </a:cxn>
                             <a:cxn ang="0">
-                              <a:pos x="connsiteX9" y="connsiteY9"/>
+                              <a:pos x="csX9" y="csY9"/>
                             </a:cxn>
                             <a:cxn ang="0">
-                              <a:pos x="connsiteX10" y="connsiteY10"/>
+                              <a:pos x="csX10" y="csY10"/>
                             </a:cxn>
                             <a:cxn ang="0">
-                              <a:pos x="connsiteX11" y="connsiteY11"/>
+                              <a:pos x="csX11" y="csY11"/>
                             </a:cxn>
                             <a:cxn ang="0">
-                              <a:pos x="connsiteX12" y="connsiteY12"/>
+                              <a:pos x="csX12" y="csY12"/>
                             </a:cxn>
                             <a:cxn ang="0">
-                              <a:pos x="connsiteX13" y="connsiteY13"/>
+                              <a:pos x="csX13" y="csY13"/>
                             </a:cxn>
                             <a:cxn ang="0">
-                              <a:pos x="connsiteX14" y="connsiteY14"/>
+                              <a:pos x="csX14" y="csY14"/>
                             </a:cxn>
                           </a:cxnLst>
                           <a:rect l="l" t="t" r="r" b="b"/>
@@ -826,6 +826,11 @@
     <w:p/>
     <w:p/>
     <w:p>
+      <w:pPr>
+        <w:rPr>
+          <w:lang w:val="en-US"/>
+        </w:rPr>
+      </w:pPr>
       <w:r>
         <w:rPr>
           <w:noProof/>
@@ -844,6 +849,229 @@
           </wp:inline>
         </w:drawing>
       </w:r>
+    </w:p>
+    <w:p>
+      <w:pPr>
+        <w:rPr>
+          <w:lang w:val="en-US"/>
+        </w:rPr>
+      </w:pPr>
+    </w:p>
+    <w:p>
+      <w:r>
+        <w:rPr>
+          <w:noProof/>
+        </w:rPr>
+        <mc:AlternateContent>
+          <mc:Choice Requires="wps">
+            <w:drawing>
+              <wp:anchor distT="0" distB="0" distL="114300" distR="114300" simplePos="0" relativeHeight="251664384" behindDoc="0" locked="0" layoutInCell="1" allowOverlap="1" wp14:anchorId="51A7BFDF" wp14:editId="2B78BBDC">
+                <wp:simplePos x="0" y="0"/>
+                <wp:positionH relativeFrom="column">
+                  <wp:posOffset>177282</wp:posOffset>
+                </wp:positionH>
+                <wp:positionV relativeFrom="paragraph">
+                  <wp:posOffset>138287</wp:posOffset>
+                </wp:positionV>
+                <wp:extent cx="3881534" cy="3704254"/>
+                <wp:effectExtent l="0" t="0" r="17780" b="17145"/>
+                <wp:wrapNone/>
+                <wp:docPr id="968042552" name="Text Box 1"/>
+                <wp:cNvGraphicFramePr/>
+                <a:graphic xmlns:a="http://schemas.openxmlformats.org/drawingml/2006/main">
+                  <a:graphicData uri="http://schemas.microsoft.com/office/word/2010/wordprocessingShape">
+                    <wps:wsp>
+                      <wps:cNvSpPr txBox="1"/>
+                      <wps:spPr>
+                        <a:xfrm>
+                          <a:off x="0" y="0"/>
+                          <a:ext cx="3881534" cy="3704254"/>
+                        </a:xfrm>
+                        <a:prstGeom prst="rect">
+                          <a:avLst/>
+                        </a:prstGeom>
+                        <a:solidFill>
+                          <a:schemeClr val="lt1"/>
+                        </a:solidFill>
+                        <a:ln w="15875">
+                          <a:solidFill>
+                            <a:prstClr val="black"/>
+                          </a:solidFill>
+                        </a:ln>
+                      </wps:spPr>
+                      <wps:txbx>
+                        <w:txbxContent>
+                          <w:p>
+                            <w:r>
+                              <w:rPr>
+                                <w:noProof/>
+                              </w:rPr>
+                              <w:drawing>
+                                <wp:inline distT="0" distB="0" distL="0" distR="0" wp14:anchorId="622231A5" wp14:editId="54D75F6E">
+                                  <wp:extent cx="3711898" cy="3135085"/>
+                                  <wp:effectExtent l="0" t="0" r="0" b="1905"/>
+                                  <wp:docPr id="1783211767" name="Picture 2"/>
+                                  <wp:cNvGraphicFramePr>
+                                    <a:graphicFrameLocks xmlns:a="http://schemas.openxmlformats.org/drawingml/2006/main" noChangeAspect="1"/>
+                                  </wp:cNvGraphicFramePr>
+                                  <a:graphic xmlns:a="http://schemas.openxmlformats.org/drawingml/2006/main">
+                                    <a:graphicData uri="http://schemas.openxmlformats.org/drawingml/2006/picture">
+                                      <pic:pic xmlns:pic="http://schemas.openxmlformats.org/drawingml/2006/picture">
+                                        <pic:nvPicPr>
+                                          <pic:cNvPr id="1783211767" name="Picture 1783211767"/>
+                                          <pic:cNvPicPr/>
+                                        </pic:nvPicPr>
+                                        <pic:blipFill>
+                                          <a:blip r:embed="rId5">
+                                            <a:extLst>
+                                              <a:ext uri="{28A0092B-C50C-407E-A947-70E740481C1C}">
+                                                <a14:useLocalDpi xmlns:a14="http://schemas.microsoft.com/office/drawing/2010/main" val="0"/>
+                                              </a:ext>
+                                            </a:extLst>
+                                          </a:blip>
+                                          <a:stretch>
+                                            <a:fillRect/>
+                                          </a:stretch>
+                                        </pic:blipFill>
+                                        <pic:spPr>
+                                          <a:xfrm>
+                                            <a:off x="0" y="0"/>
+                                            <a:ext cx="3833834" cy="3238072"/>
+                                          </a:xfrm>
+                                          <a:prstGeom prst="rect">
+                                            <a:avLst/>
+                                          </a:prstGeom>
+                                        </pic:spPr>
+                                      </pic:pic>
+                                    </a:graphicData>
+                                  </a:graphic>
+                                </wp:inline>
+                              </w:drawing>
+                            </w:r>
+                          </w:p>
+                          <w:p>
+                            <w:pPr>
+                              <w:jc w:val="center"/>
+                              <w:rPr>
+                                <w:sz w:val="32"/>
+                                <w:szCs w:val="32"/>
+                              </w:rPr>
+                            </w:pPr>
+                            <w:r>
+                              <w:rPr>
+                                <w:sz w:val="32"/>
+                                <w:szCs w:val="32"/>
+                              </w:rPr>
+                              <w:t>Fig – Torque v/s Speed characteristics</w:t>
+                            </w:r>
+                          </w:p>
+                        </w:txbxContent>
+                      </wps:txbx>
+                      <wps:bodyPr rot="0" spcFirstLastPara="0" vertOverflow="overflow" horzOverflow="overflow" vert="horz" wrap="square" lIns="91440" tIns="45720" rIns="91440" bIns="45720" numCol="1" spcCol="0" rtlCol="0" fromWordArt="0" anchor="t" anchorCtr="0" forceAA="0" compatLnSpc="1">
+                        <a:prstTxWarp prst="textNoShape">
+                          <a:avLst/>
+                        </a:prstTxWarp>
+                        <a:noAutofit/>
+                      </wps:bodyPr>
+                    </wps:wsp>
+                  </a:graphicData>
+                </a:graphic>
+                <wp14:sizeRelH relativeFrom="margin">
+                  <wp14:pctWidth>0</wp14:pctWidth>
+                </wp14:sizeRelH>
+                <wp14:sizeRelV relativeFrom="margin">
+                  <wp14:pctHeight>0</wp14:pctHeight>
+                </wp14:sizeRelV>
+              </wp:anchor>
+            </w:drawing>
+          </mc:Choice>
+          <mc:Fallback>
+            <w:pict>
+              <v:shapetype w14:anchorId="51A7BFDF" id="_x0000_t202" coordsize="21600,21600" o:spt="202" path="m,l,21600r21600,l21600,xe">
+                <v:stroke joinstyle="miter"/>
+                <v:path gradientshapeok="t" o:connecttype="rect"/>
+              </v:shapetype>
+              <v:shape id="Text Box 1" o:spid="_x0000_s1028" type="#_x0000_t202" style="position:absolute;margin-left:13.95pt;margin-top:10.9pt;width:305.65pt;height:291.65pt;z-index:251664384;visibility:visible;mso-wrap-style:square;mso-width-percent:0;mso-height-percent:0;mso-wrap-distance-left:9pt;mso-wrap-distance-top:0;mso-wrap-distance-right:9pt;mso-wrap-distance-bottom:0;mso-position-horizontal:absolute;mso-position-horizontal-relative:text;mso-position-vertical:absolute;mso-position-vertical-relative:text;mso-width-percent:0;mso-height-percent:0;mso-width-relative:margin;mso-height-relative:margin;v-text-anchor:top" o:gfxdata="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" fillcolor="white [3201]" strokeweight="1.25pt">
+                <v:textbox>
+                  <w:txbxContent>
+                    <w:p>
+                      <w:r>
+                        <w:rPr>
+                          <w:noProof/>
+                        </w:rPr>
+                        <w:drawing>
+                          <wp:inline distT="0" distB="0" distL="0" distR="0" wp14:anchorId="622231A5" wp14:editId="54D75F6E">
+                            <wp:extent cx="3711898" cy="3135085"/>
+                            <wp:effectExtent l="0" t="0" r="0" b="1905"/>
+                            <wp:docPr id="1783211767" name="Picture 2"/>
+                            <wp:cNvGraphicFramePr>
+                              <a:graphicFrameLocks xmlns:a="http://schemas.openxmlformats.org/drawingml/2006/main" noChangeAspect="1"/>
+                            </wp:cNvGraphicFramePr>
+                            <a:graphic xmlns:a="http://schemas.openxmlformats.org/drawingml/2006/main">
+                              <a:graphicData uri="http://schemas.openxmlformats.org/drawingml/2006/picture">
+                                <pic:pic xmlns:pic="http://schemas.openxmlformats.org/drawingml/2006/picture">
+                                  <pic:nvPicPr>
+                                    <pic:cNvPr id="1783211767" name="Picture 1783211767"/>
+                                    <pic:cNvPicPr/>
+                                  </pic:nvPicPr>
+                                  <pic:blipFill>
+                                    <a:blip r:embed="rId5">
+                                      <a:extLst>
+                                        <a:ext uri="{28A0092B-C50C-407E-A947-70E740481C1C}">
+                                          <a14:useLocalDpi xmlns:a14="http://schemas.microsoft.com/office/drawing/2010/main" val="0"/>
+                                        </a:ext>
+                                      </a:extLst>
+                                    </a:blip>
+                                    <a:stretch>
+                                      <a:fillRect/>
+                                    </a:stretch>
+                                  </pic:blipFill>
+                                  <pic:spPr>
+                                    <a:xfrm>
+                                      <a:off x="0" y="0"/>
+                                      <a:ext cx="3833834" cy="3238072"/>
+                                    </a:xfrm>
+                                    <a:prstGeom prst="rect">
+                                      <a:avLst/>
+                                    </a:prstGeom>
+                                  </pic:spPr>
+                                </pic:pic>
+                              </a:graphicData>
+                            </a:graphic>
+                          </wp:inline>
+                        </w:drawing>
+                      </w:r>
+                    </w:p>
+                    <w:p>
+                      <w:pPr>
+                        <w:jc w:val="center"/>
+                        <w:rPr>
+                          <w:sz w:val="32"/>
+                          <w:szCs w:val="32"/>
+                        </w:rPr>
+                      </w:pPr>
+                      <w:r>
+                        <w:rPr>
+                          <w:sz w:val="32"/>
+                          <w:szCs w:val="32"/>
+                        </w:rPr>
+                        <w:t>Fig – Torque v/s Speed characteristics</w:t>
+                      </w:r>
+                    </w:p>
+                  </w:txbxContent>
+                </v:textbox>
+              </v:shape>
+            </w:pict>
+          </mc:Fallback>
+        </mc:AlternateContent>
+      </w:r>
+    </w:p>
+    <w:p>
+      <w:pPr>
+        <w:rPr>
+          <w:lang w:val="en-US"/>
+        </w:rPr>
+      </w:pPr>
     </w:p>
     <w:sectPr>
       <w:pgSz w:w="11906" w:h="16838"/>
@@ -864,7 +1092,7 @@
         <w:kern w:val="2"/>
         <w:sz w:val="24"/>
         <w:szCs w:val="24"/>
-        <w:lang w:val="en-FR" w:eastAsia="en-US" w:bidi="ar-SA"/>
+        <w:lang w:eastAsia="en-US" w:bidi="ar-SA"/>
         <w14:ligatures w14:val="standardContextual"/>
       </w:rPr>
     </w:rPrDefault>

</xml_diff>